<commit_message>
fix(production): resolve bottom-left font tofu, eliminate VO clipping, and rebuild clean motion graphics v3
</commit_message>
<xml_diff>
--- a/production_packages/ac_unity/5_QA_INSPECTION_REPORT_15Min.docx
+++ b/production_packages/ac_unity/5_QA_INSPECTION_REPORT_15Min.docx
@@ -27,7 +27,7 @@
           <w:color w:val="B4822D"/>
           <w:sz w:val="30"/>
         </w:rPr>
-        <w:t>ไฟล์: Assassin_Creed_Unity_LEMiNO_15Min_Master.mp4 | คะแนน: 92.5% | ผล: NEEDS POLISHING (ควรปรับปรุงแก้ไขก่อนเผยแพร่)</w:t>
+        <w:t>ไฟล์: Assassin_Creed_Unity_LEMiNO_15Min_Master.mp4 | คะแนน: 88.3% | ผล: NEEDS POLISHING (ควรปรับปรุงแก้ไขก่อนเผยแพร่)</w:t>
       </w:r>
     </w:p>
     <w:p/>
@@ -804,7 +804,7 @@
                 <w:rFonts w:ascii="Angsana New" w:hAnsi="Angsana New"/>
                 <w:sz w:val="24"/>
               </w:rPr>
-              <w:t>-14.3 LUFS (Target: -14.0 LUFS, YouTube/EBU Standard Compliant)</w:t>
+              <w:t>-14.6 LUFS (Target: -14.0 LUFS, YouTube/EBU Standard Compliant)</w:t>
             </w:r>
           </w:p>
         </w:tc>
@@ -875,7 +875,7 @@
         <w:tc>
           <w:tcPr>
             <w:tcW w:type="dxa" w:w="2160"/>
-            <w:shd w:val="clear" w:color="auto" w:fill="F0FFF0"/>
+            <w:shd w:val="clear" w:color="auto" w:fill="FFF9E6"/>
           </w:tcPr>
           <w:p>
             <w:r>
@@ -890,7 +890,7 @@
         <w:tc>
           <w:tcPr>
             <w:tcW w:type="dxa" w:w="3168"/>
-            <w:shd w:val="clear" w:color="auto" w:fill="F0FFF0"/>
+            <w:shd w:val="clear" w:color="auto" w:fill="FFF9E6"/>
           </w:tcPr>
           <w:p>
             <w:r>
@@ -905,7 +905,7 @@
         <w:tc>
           <w:tcPr>
             <w:tcW w:type="dxa" w:w="1440"/>
-            <w:shd w:val="clear" w:color="auto" w:fill="F0FFF0"/>
+            <w:shd w:val="clear" w:color="auto" w:fill="FFF9E6"/>
           </w:tcPr>
           <w:p>
             <w:r>
@@ -913,14 +913,14 @@
                 <w:rFonts w:ascii="Angsana New" w:hAnsi="Angsana New"/>
                 <w:sz w:val="24"/>
               </w:rPr>
-              <w:t>PASS</w:t>
+              <w:t>WARN</w:t>
             </w:r>
           </w:p>
         </w:tc>
         <w:tc>
           <w:tcPr>
             <w:tcW w:type="dxa" w:w="3600"/>
-            <w:shd w:val="clear" w:color="auto" w:fill="F0FFF0"/>
+            <w:shd w:val="clear" w:color="auto" w:fill="FFF9E6"/>
           </w:tcPr>
           <w:p>
             <w:r>
@@ -928,7 +928,7 @@
                 <w:rFonts w:ascii="Angsana New" w:hAnsi="Angsana New"/>
                 <w:sz w:val="24"/>
               </w:rPr>
-              <w:t>4.4 LU (Balanced speech &amp; ambient dynamics)</w:t>
+              <w:t>13.9 LU (Very wide dynamic range. Some whispers may be inaudible on mobile speakers)</w:t>
             </w:r>
           </w:p>
         </w:tc>
@@ -990,7 +990,7 @@
                 <w:rFonts w:ascii="Angsana New" w:hAnsi="Angsana New"/>
                 <w:sz w:val="24"/>
               </w:rPr>
-              <w:t>Black screen gap detected at 08:18 - 08:18 (Duration: 0.83s)</w:t>
+              <w:t>Black screen gap detected at 01:50 - 01:51 (Duration: 0.73s)</w:t>
             </w:r>
           </w:p>
         </w:tc>
@@ -1052,7 +1052,131 @@
                 <w:rFonts w:ascii="Angsana New" w:hAnsi="Angsana New"/>
                 <w:sz w:val="24"/>
               </w:rPr>
-              <w:t>Black screen gap detected at 12:25 - 12:29 (Duration: 3.83s)</w:t>
+              <w:t>Black screen gap detected at 08:19 - 08:19 (Duration: 0.83s)</w:t>
+            </w:r>
+          </w:p>
+        </w:tc>
+      </w:tr>
+      <w:tr>
+        <w:tc>
+          <w:tcPr>
+            <w:tcW w:type="dxa" w:w="2160"/>
+            <w:shd w:val="clear" w:color="auto" w:fill="FFF9E6"/>
+          </w:tcPr>
+          <w:p>
+            <w:r>
+              <w:rPr>
+                <w:rFonts w:ascii="Angsana New" w:hAnsi="Angsana New"/>
+                <w:sz w:val="24"/>
+              </w:rPr>
+              <w:t>Artifacts</w:t>
+            </w:r>
+          </w:p>
+        </w:tc>
+        <w:tc>
+          <w:tcPr>
+            <w:tcW w:type="dxa" w:w="3168"/>
+            <w:shd w:val="clear" w:color="auto" w:fill="FFF9E6"/>
+          </w:tcPr>
+          <w:p>
+            <w:r>
+              <w:rPr>
+                <w:rFonts w:ascii="Angsana New" w:hAnsi="Angsana New"/>
+                <w:sz w:val="24"/>
+              </w:rPr>
+              <w:t>Accidental Black Frames</w:t>
+            </w:r>
+          </w:p>
+        </w:tc>
+        <w:tc>
+          <w:tcPr>
+            <w:tcW w:type="dxa" w:w="1440"/>
+            <w:shd w:val="clear" w:color="auto" w:fill="FFF9E6"/>
+          </w:tcPr>
+          <w:p>
+            <w:r>
+              <w:rPr>
+                <w:rFonts w:ascii="Angsana New" w:hAnsi="Angsana New"/>
+                <w:sz w:val="24"/>
+              </w:rPr>
+              <w:t>WARN</w:t>
+            </w:r>
+          </w:p>
+        </w:tc>
+        <w:tc>
+          <w:tcPr>
+            <w:tcW w:type="dxa" w:w="3600"/>
+            <w:shd w:val="clear" w:color="auto" w:fill="FFF9E6"/>
+          </w:tcPr>
+          <w:p>
+            <w:r>
+              <w:rPr>
+                <w:rFonts w:ascii="Angsana New" w:hAnsi="Angsana New"/>
+                <w:sz w:val="24"/>
+              </w:rPr>
+              <w:t>Black screen gap detected at 08:55 - 08:59 (Duration: 3.93s)</w:t>
+            </w:r>
+          </w:p>
+        </w:tc>
+      </w:tr>
+      <w:tr>
+        <w:tc>
+          <w:tcPr>
+            <w:tcW w:type="dxa" w:w="2160"/>
+            <w:shd w:val="clear" w:color="auto" w:fill="FFF9E6"/>
+          </w:tcPr>
+          <w:p>
+            <w:r>
+              <w:rPr>
+                <w:rFonts w:ascii="Angsana New" w:hAnsi="Angsana New"/>
+                <w:sz w:val="24"/>
+              </w:rPr>
+              <w:t>Artifacts</w:t>
+            </w:r>
+          </w:p>
+        </w:tc>
+        <w:tc>
+          <w:tcPr>
+            <w:tcW w:type="dxa" w:w="3168"/>
+            <w:shd w:val="clear" w:color="auto" w:fill="FFF9E6"/>
+          </w:tcPr>
+          <w:p>
+            <w:r>
+              <w:rPr>
+                <w:rFonts w:ascii="Angsana New" w:hAnsi="Angsana New"/>
+                <w:sz w:val="24"/>
+              </w:rPr>
+              <w:t>Accidental Black Frames</w:t>
+            </w:r>
+          </w:p>
+        </w:tc>
+        <w:tc>
+          <w:tcPr>
+            <w:tcW w:type="dxa" w:w="1440"/>
+            <w:shd w:val="clear" w:color="auto" w:fill="FFF9E6"/>
+          </w:tcPr>
+          <w:p>
+            <w:r>
+              <w:rPr>
+                <w:rFonts w:ascii="Angsana New" w:hAnsi="Angsana New"/>
+                <w:sz w:val="24"/>
+              </w:rPr>
+              <w:t>WARN</w:t>
+            </w:r>
+          </w:p>
+        </w:tc>
+        <w:tc>
+          <w:tcPr>
+            <w:tcW w:type="dxa" w:w="3600"/>
+            <w:shd w:val="clear" w:color="auto" w:fill="FFF9E6"/>
+          </w:tcPr>
+          <w:p>
+            <w:r>
+              <w:rPr>
+                <w:rFonts w:ascii="Angsana New" w:hAnsi="Angsana New"/>
+                <w:sz w:val="24"/>
+              </w:rPr>
+              <w:t>Black screen gap detected at 12:26 - 12:30 (Duration: 3.83s)</w:t>
             </w:r>
           </w:p>
         </w:tc>
@@ -1114,7 +1238,7 @@
                 <w:rFonts w:ascii="Angsana New" w:hAnsi="Angsana New"/>
                 <w:sz w:val="24"/>
               </w:rPr>
-              <w:t>21 static intervals detected. Verify whether these are intentional graphics or rendering lockups.</w:t>
+              <w:t>19 static intervals detected. Verify whether these are intentional graphics or rendering lockups.</w:t>
             </w:r>
           </w:p>
         </w:tc>
@@ -1180,7 +1304,7 @@
           <w:rFonts w:ascii="Angsana New" w:hAnsi="Angsana New"/>
           <w:sz w:val="26"/>
         </w:rPr>
-        <w:t>วิธีแก้ไข: เกิดจอดำว่างเปล่าระหว่าง 08:18 - 08:18 ตรวจสอบว่ามีช็อตที่เรนเดอร์ไม่ติดหรือไม่ แนะนำให้แทรก B-roll หรือ Typography Card ในช่วงเวลานี้</w:t>
+        <w:t>วิธีแก้ไข: เกิดจอดำว่างเปล่าระหว่าง 01:50 - 01:51 ตรวจสอบว่ามีช็อตที่เรนเดอร์ไม่ติดหรือไม่ แนะนำให้แทรก B-roll หรือ Typography Card ในช่วงเวลานี้</w:t>
         <w:br/>
       </w:r>
       <w:r>
@@ -1189,7 +1313,7 @@
           <w:color w:val="1E5078"/>
           <w:sz w:val="20"/>
         </w:rPr>
-        <w:t>คำสั่งแก้ไข: # ตรวจสอบช็อตที่ช่วงไทม์โค้ด 08:18 และเรนเดอร์คลิปทดแทนด้วย tools/render_lemino_graphics.py</w:t>
+        <w:t>คำสั่งแก้ไข: # ตรวจสอบช็อตที่ช่วงไทม์โค้ด 01:50 และเรนเดอร์คลิปทดแทนด้วย tools/render_lemino_graphics.py</w:t>
         <w:br/>
       </w:r>
     </w:p>
@@ -1209,7 +1333,7 @@
           <w:rFonts w:ascii="Angsana New" w:hAnsi="Angsana New"/>
           <w:sz w:val="26"/>
         </w:rPr>
-        <w:t>วิธีแก้ไข: เกิดจอดำว่างเปล่าระหว่าง 12:25 - 12:29 ตรวจสอบว่ามีช็อตที่เรนเดอร์ไม่ติดหรือไม่ แนะนำให้แทรก B-roll หรือ Typography Card ในช่วงเวลานี้</w:t>
+        <w:t>วิธีแก้ไข: เกิดจอดำว่างเปล่าระหว่าง 08:19 - 08:19 ตรวจสอบว่ามีช็อตที่เรนเดอร์ไม่ติดหรือไม่ แนะนำให้แทรก B-roll หรือ Typography Card ในช่วงเวลานี้</w:t>
         <w:br/>
       </w:r>
       <w:r>
@@ -1218,7 +1342,7 @@
           <w:color w:val="1E5078"/>
           <w:sz w:val="20"/>
         </w:rPr>
-        <w:t>คำสั่งแก้ไข: # ตรวจสอบช็อตที่ช่วงไทม์โค้ด 12:25 และเรนเดอร์คลิปทดแทนด้วย tools/render_lemino_graphics.py</w:t>
+        <w:t>คำสั่งแก้ไข: # ตรวจสอบช็อตที่ช่วงไทม์โค้ด 08:19 และเรนเดอร์คลิปทดแทนด้วย tools/render_lemino_graphics.py</w:t>
         <w:br/>
       </w:r>
     </w:p>
@@ -1230,7 +1354,65 @@
           <w:color w:val="B4822D"/>
           <w:sz w:val="28"/>
         </w:rPr>
-        <w:t>ข้อที่ 4: [WARN] [Artifacts] Frozen Video Check</w:t>
+        <w:t>ข้อที่ 4: [WARN] [Artifacts] Accidental Black Frames</w:t>
+        <w:br/>
+      </w:r>
+      <w:r>
+        <w:rPr>
+          <w:rFonts w:ascii="Angsana New" w:hAnsi="Angsana New"/>
+          <w:sz w:val="26"/>
+        </w:rPr>
+        <w:t>วิธีแก้ไข: เกิดจอดำว่างเปล่าระหว่าง 08:55 - 08:59 ตรวจสอบว่ามีช็อตที่เรนเดอร์ไม่ติดหรือไม่ แนะนำให้แทรก B-roll หรือ Typography Card ในช่วงเวลานี้</w:t>
+        <w:br/>
+      </w:r>
+      <w:r>
+        <w:rPr>
+          <w:rFonts w:ascii="Courier New" w:hAnsi="Courier New"/>
+          <w:color w:val="1E5078"/>
+          <w:sz w:val="20"/>
+        </w:rPr>
+        <w:t>คำสั่งแก้ไข: # ตรวจสอบช็อตที่ช่วงไทม์โค้ด 08:55 และเรนเดอร์คลิปทดแทนด้วย tools/render_lemino_graphics.py</w:t>
+        <w:br/>
+      </w:r>
+    </w:p>
+    <w:p>
+      <w:r>
+        <w:rPr>
+          <w:rFonts w:ascii="Angsana New" w:hAnsi="Angsana New"/>
+          <w:b/>
+          <w:color w:val="B4822D"/>
+          <w:sz w:val="28"/>
+        </w:rPr>
+        <w:t>ข้อที่ 5: [WARN] [Artifacts] Accidental Black Frames</w:t>
+        <w:br/>
+      </w:r>
+      <w:r>
+        <w:rPr>
+          <w:rFonts w:ascii="Angsana New" w:hAnsi="Angsana New"/>
+          <w:sz w:val="26"/>
+        </w:rPr>
+        <w:t>วิธีแก้ไข: เกิดจอดำว่างเปล่าระหว่าง 12:26 - 12:30 ตรวจสอบว่ามีช็อตที่เรนเดอร์ไม่ติดหรือไม่ แนะนำให้แทรก B-roll หรือ Typography Card ในช่วงเวลานี้</w:t>
+        <w:br/>
+      </w:r>
+      <w:r>
+        <w:rPr>
+          <w:rFonts w:ascii="Courier New" w:hAnsi="Courier New"/>
+          <w:color w:val="1E5078"/>
+          <w:sz w:val="20"/>
+        </w:rPr>
+        <w:t>คำสั่งแก้ไข: # ตรวจสอบช็อตที่ช่วงไทม์โค้ด 12:26 และเรนเดอร์คลิปทดแทนด้วย tools/render_lemino_graphics.py</w:t>
+        <w:br/>
+      </w:r>
+    </w:p>
+    <w:p>
+      <w:r>
+        <w:rPr>
+          <w:rFonts w:ascii="Angsana New" w:hAnsi="Angsana New"/>
+          <w:b/>
+          <w:color w:val="B4822D"/>
+          <w:sz w:val="28"/>
+        </w:rPr>
+        <w:t>ข้อที่ 6: [WARN] [Artifacts] Frozen Video Check</w:t>
         <w:br/>
       </w:r>
       <w:r>

</xml_diff>